<commit_message>
Modifiche sql e relazione basi di dati
</commit_message>
<xml_diff>
--- a/Base di Dati/Relazione Basi di Dati--Gruppo2.docx
+++ b/Base di Dati/Relazione Basi di Dati--Gruppo2.docx
@@ -3002,164 +3002,6 @@
       <w:proofErr w:type="spellEnd"/>
       <w:r>
         <w:t xml:space="preserve"> DESC;</w:t>
-      </w:r>
-    </w:p>
-    <w:p>
-      <w:pPr>
-        <w:spacing w:after="0"/>
-      </w:pPr>
-    </w:p>
-    <w:p>
-      <w:pPr>
-        <w:spacing w:after="0"/>
-      </w:pPr>
-      <w:r>
-        <w:rPr>
-          <w:i/>
-          <w:iCs/>
-        </w:rPr>
-        <w:t>-- Esportazione per anonimizzazione in file csv</w:t>
-      </w:r>
-    </w:p>
-    <w:p>
-      <w:pPr>
-        <w:spacing w:after="0"/>
-      </w:pPr>
-      <w:r>
-        <w:t xml:space="preserve">SELECT </w:t>
-      </w:r>
-      <w:proofErr w:type="spellStart"/>
-      <w:r>
-        <w:t>pa.Nome</w:t>
-      </w:r>
-      <w:proofErr w:type="spellEnd"/>
-      <w:r>
-        <w:t xml:space="preserve"> AS </w:t>
-      </w:r>
-      <w:proofErr w:type="spellStart"/>
-      <w:r>
-        <w:t>Nome_Paziente</w:t>
-      </w:r>
-      <w:proofErr w:type="spellEnd"/>
-      <w:r>
-        <w:t xml:space="preserve">, </w:t>
-      </w:r>
-      <w:proofErr w:type="spellStart"/>
-      <w:r>
-        <w:t>pa.Cognome</w:t>
-      </w:r>
-      <w:proofErr w:type="spellEnd"/>
-      <w:r>
-        <w:t xml:space="preserve"> AS </w:t>
-      </w:r>
-      <w:proofErr w:type="spellStart"/>
-      <w:r>
-        <w:t>Cognome_Paziente</w:t>
-      </w:r>
-      <w:proofErr w:type="spellEnd"/>
-      <w:r>
-        <w:t>,</w:t>
-      </w:r>
-    </w:p>
-    <w:p>
-      <w:pPr>
-        <w:spacing w:after="0"/>
-      </w:pPr>
-      <w:r>
-        <w:t xml:space="preserve">    </w:t>
-      </w:r>
-      <w:proofErr w:type="spellStart"/>
-      <w:r>
-        <w:t>pa.Codice_Fiscale</w:t>
-      </w:r>
-      <w:proofErr w:type="spellEnd"/>
-      <w:r>
-        <w:t xml:space="preserve">, </w:t>
-      </w:r>
-      <w:proofErr w:type="spellStart"/>
-      <w:r>
-        <w:t>pr.Data_Emissione</w:t>
-      </w:r>
-      <w:proofErr w:type="spellEnd"/>
-      <w:r>
-        <w:t xml:space="preserve">, </w:t>
-      </w:r>
-      <w:proofErr w:type="spellStart"/>
-      <w:r>
-        <w:t>fa.Nome_Farmaco</w:t>
-      </w:r>
-      <w:proofErr w:type="spellEnd"/>
-    </w:p>
-    <w:p>
-      <w:pPr>
-        <w:spacing w:after="0"/>
-        <w:rPr>
-          <w:u w:val="single"/>
-        </w:rPr>
-      </w:pPr>
-      <w:r>
-        <w:t xml:space="preserve">FROM Prescrizioni </w:t>
-      </w:r>
-      <w:proofErr w:type="spellStart"/>
-      <w:r>
-        <w:t>pr</w:t>
-      </w:r>
-      <w:proofErr w:type="spellEnd"/>
-      <w:r>
-        <w:t xml:space="preserve"> </w:t>
-      </w:r>
-    </w:p>
-    <w:p>
-      <w:pPr>
-        <w:spacing w:after="0"/>
-      </w:pPr>
-      <w:r>
-        <w:t xml:space="preserve">JOIN Pazienti </w:t>
-      </w:r>
-      <w:proofErr w:type="spellStart"/>
-      <w:r>
-        <w:t>pa</w:t>
-      </w:r>
-      <w:proofErr w:type="spellEnd"/>
-      <w:r>
-        <w:t xml:space="preserve"> ON </w:t>
-      </w:r>
-      <w:proofErr w:type="spellStart"/>
-      <w:r>
-        <w:t>pr.ID_Paziente</w:t>
-      </w:r>
-      <w:proofErr w:type="spellEnd"/>
-      <w:r>
-        <w:t xml:space="preserve"> = </w:t>
-      </w:r>
-      <w:proofErr w:type="spellStart"/>
-      <w:r>
-        <w:t>pa.ID_Paziente</w:t>
-      </w:r>
-      <w:proofErr w:type="spellEnd"/>
-    </w:p>
-    <w:p>
-      <w:pPr>
-        <w:spacing w:after="0"/>
-      </w:pPr>
-      <w:r>
-        <w:t xml:space="preserve">JOIN Farmaci fa ON </w:t>
-      </w:r>
-      <w:proofErr w:type="spellStart"/>
-      <w:r>
-        <w:t>pr.Codice_AIC</w:t>
-      </w:r>
-      <w:proofErr w:type="spellEnd"/>
-      <w:r>
-        <w:t xml:space="preserve"> = </w:t>
-      </w:r>
-      <w:proofErr w:type="spellStart"/>
-      <w:r>
-        <w:t>fa.Codice_AIC</w:t>
-      </w:r>
-      <w:proofErr w:type="spellEnd"/>
-      <w:r>
-        <w:t>;</w:t>
       </w:r>
     </w:p>
     <w:sectPr>

</xml_diff>

<commit_message>
modifica tabella pazienti sql
</commit_message>
<xml_diff>
--- a/Base di Dati/Relazione Basi di Dati--Gruppo2.docx
+++ b/Base di Dati/Relazione Basi di Dati--Gruppo2.docx
@@ -1128,15 +1128,7 @@
     </w:p>
     <w:p>
       <w:r>
-        <w:t xml:space="preserve">La </w:t>
-      </w:r>
-      <w:proofErr w:type="spellStart"/>
-      <w:r>
-        <w:t>strutttura</w:t>
-      </w:r>
-      <w:proofErr w:type="spellEnd"/>
-      <w:r>
-        <w:t xml:space="preserve"> dei </w:t>
+        <w:t xml:space="preserve">La strutttura dei </w:t>
       </w:r>
       <w:r>
         <w:t>dati è stata estrapolata dall’analisi del file XML fornito (2_Specifiche_Prescrizioni.xml) che implementa lo standard HL7 CDA R2.</w:t>
@@ -1151,15 +1143,7 @@
         <w:t>Paziente:</w:t>
       </w:r>
       <w:r>
-        <w:t xml:space="preserve"> Dati estratti dal nodo &lt;</w:t>
-      </w:r>
-      <w:proofErr w:type="spellStart"/>
-      <w:r>
-        <w:t>recordTarget</w:t>
-      </w:r>
-      <w:proofErr w:type="spellEnd"/>
-      <w:r>
-        <w:t>&gt; (Nome, Cognome, Codice Fiscale).</w:t>
+        <w:t xml:space="preserve"> Dati estratti dal nodo &lt;recordTarget&gt; (Nome, Cognome, Codice Fiscale).</w:t>
       </w:r>
     </w:p>
     <w:p>
@@ -1171,15 +1155,7 @@
         <w:t>Medico:</w:t>
       </w:r>
       <w:r>
-        <w:t xml:space="preserve"> Dati estratti dal nodo &lt;</w:t>
-      </w:r>
-      <w:proofErr w:type="spellStart"/>
-      <w:r>
-        <w:t>author</w:t>
-      </w:r>
-      <w:proofErr w:type="spellEnd"/>
-      <w:r>
-        <w:t>&gt; e associati all'evento di firma clinica.</w:t>
+        <w:t xml:space="preserve"> Dati estratti dal nodo &lt;author&gt; e associati all'evento di firma clinica.</w:t>
       </w:r>
     </w:p>
     <w:p>
@@ -1191,15 +1167,7 @@
         <w:t>Farmaco:</w:t>
       </w:r>
       <w:r>
-        <w:t xml:space="preserve"> Identificato in modo univoco tramite il codice a 9 cifre AIC e il nome commerciale dal nodo &lt;</w:t>
-      </w:r>
-      <w:proofErr w:type="spellStart"/>
-      <w:r>
-        <w:t>manufacturedMaterial</w:t>
-      </w:r>
-      <w:proofErr w:type="spellEnd"/>
-      <w:r>
-        <w:t xml:space="preserve">&gt;. </w:t>
+        <w:t xml:space="preserve"> Identificato in modo univoco tramite il codice a 9 cifre AIC e il nome commerciale dal nodo &lt;manufacturedMaterial&gt;. </w:t>
       </w:r>
     </w:p>
     <w:p>
@@ -1211,15 +1179,7 @@
         <w:t>Prescrizione:</w:t>
       </w:r>
       <w:r>
-        <w:t xml:space="preserve"> Estratto dal blocco strutturato &lt;supply </w:t>
-      </w:r>
-      <w:proofErr w:type="spellStart"/>
-      <w:r>
-        <w:t>moodCode</w:t>
-      </w:r>
-      <w:proofErr w:type="spellEnd"/>
-      <w:r>
-        <w:t xml:space="preserve">="RQO"&gt;, contenente ID del documento, data di emissione, organizzazione custode e quantità prescritta. </w:t>
+        <w:t xml:space="preserve"> Estratto dal blocco strutturato &lt;supply moodCode="RQO"&gt;, contenente ID del documento, data di emissione, organizzazione custode e quantità prescritta. </w:t>
       </w:r>
     </w:p>
     <w:p>
@@ -1257,15 +1217,7 @@
         <w:t>PAZIENTE:</w:t>
       </w:r>
       <w:r>
-        <w:t xml:space="preserve"> Identificato univocamente dal </w:t>
-      </w:r>
-      <w:proofErr w:type="spellStart"/>
-      <w:r>
-        <w:t>Codice_Fiscale</w:t>
-      </w:r>
-      <w:proofErr w:type="spellEnd"/>
-      <w:r>
-        <w:t>.</w:t>
+        <w:t xml:space="preserve"> Identificato univocamente dal Codice_Fiscale.</w:t>
       </w:r>
     </w:p>
     <w:p>
@@ -1283,15 +1235,7 @@
         <w:t>MEDICO:</w:t>
       </w:r>
       <w:r>
-        <w:t xml:space="preserve"> Identificato dall'</w:t>
-      </w:r>
-      <w:proofErr w:type="spellStart"/>
-      <w:r>
-        <w:t>ID_Medico</w:t>
-      </w:r>
-      <w:proofErr w:type="spellEnd"/>
-      <w:r>
-        <w:t>.</w:t>
+        <w:t xml:space="preserve"> Identificato dall'ID_Medico.</w:t>
       </w:r>
     </w:p>
     <w:p>
@@ -1309,15 +1253,7 @@
         <w:t>FARMACO:</w:t>
       </w:r>
       <w:r>
-        <w:t xml:space="preserve"> Identificato dal </w:t>
-      </w:r>
-      <w:proofErr w:type="spellStart"/>
-      <w:r>
-        <w:t>Codice_AIC</w:t>
-      </w:r>
-      <w:proofErr w:type="spellEnd"/>
-      <w:r>
-        <w:t>.</w:t>
+        <w:t xml:space="preserve"> Identificato dal Codice_AIC.</w:t>
       </w:r>
     </w:p>
     <w:p>
@@ -1335,23 +1271,7 @@
         <w:t>PRESCRIZIONE:</w:t>
       </w:r>
       <w:r>
-        <w:t xml:space="preserve"> Entità centrale identificata dall'</w:t>
-      </w:r>
-      <w:proofErr w:type="spellStart"/>
-      <w:r>
-        <w:t>ID_Prescrizione</w:t>
-      </w:r>
-      <w:proofErr w:type="spellEnd"/>
-      <w:r>
-        <w:t xml:space="preserve"> (che funge da ID del documento FSE). Possiede come attributi propri la </w:t>
-      </w:r>
-      <w:proofErr w:type="spellStart"/>
-      <w:r>
-        <w:t>Data_Emissione</w:t>
-      </w:r>
-      <w:proofErr w:type="spellEnd"/>
-      <w:r>
-        <w:t>, l'Organizzazione responsabile e il Dettaglio testuale.</w:t>
+        <w:t xml:space="preserve"> Entità centrale identificata dall'ID_Prescrizione (che funge da ID del documento FSE). Possiede come attributi propri la Data_Emissione, l'Organizzazione responsabile e il Dettaglio testuale.</w:t>
       </w:r>
     </w:p>
     <w:p>
@@ -1484,23 +1404,7 @@
         <w:jc w:val="both"/>
       </w:pPr>
       <w:r>
-        <w:t xml:space="preserve">La relazione N:M "Contiene", che normalmente richiederebbe una quinta tabella di appoggio, è stata risolta collassando l'attributo </w:t>
-      </w:r>
-      <w:proofErr w:type="spellStart"/>
-      <w:r>
-        <w:t>Codice_AIC</w:t>
-      </w:r>
-      <w:proofErr w:type="spellEnd"/>
-      <w:r>
-        <w:t xml:space="preserve"> e </w:t>
-      </w:r>
-      <w:proofErr w:type="spellStart"/>
-      <w:r>
-        <w:t>Quantita</w:t>
-      </w:r>
-      <w:proofErr w:type="spellEnd"/>
-      <w:r>
-        <w:t xml:space="preserve"> direttamente all'interno della tabella Prescrizioni. Questa scelta è coerente con il caso d'uso specifico dell'XML analizzato, in cui un documento di ricetta farmaceutica definisce la fornitura di un singolo item prescritto.</w:t>
+        <w:t>La relazione N:M "Contiene", che normalmente richiederebbe una quinta tabella di appoggio, è stata risolta collassando l'attributo Codice_AIC e Quantita direttamente all'interno della tabella Prescrizioni. Questa scelta è coerente con il caso d'uso specifico dell'XML analizzato, in cui un documento di ricetta farmaceutica definisce la fornitura di un singolo item prescritto.</w:t>
       </w:r>
     </w:p>
     <w:p>
@@ -1519,14 +1423,12 @@
       <w:r>
         <w:t>(</w:t>
       </w:r>
-      <w:proofErr w:type="spellStart"/>
       <w:r>
         <w:rPr>
           <w:u w:val="single"/>
         </w:rPr>
         <w:t>Codice_Fiscale</w:t>
       </w:r>
-      <w:proofErr w:type="spellEnd"/>
       <w:r>
         <w:t>, Nome, Cognome)</w:t>
       </w:r>
@@ -1542,14 +1444,12 @@
       <w:r>
         <w:t>(</w:t>
       </w:r>
-      <w:proofErr w:type="spellStart"/>
       <w:r>
         <w:rPr>
           <w:u w:val="single"/>
         </w:rPr>
         <w:t>ID_Medico</w:t>
       </w:r>
-      <w:proofErr w:type="spellEnd"/>
       <w:r>
         <w:t>, Nome, Cognome)</w:t>
       </w:r>
@@ -1565,24 +1465,14 @@
       <w:r>
         <w:t>(</w:t>
       </w:r>
-      <w:proofErr w:type="spellStart"/>
       <w:r>
         <w:rPr>
           <w:u w:val="single"/>
         </w:rPr>
         <w:t>Codice_AIC</w:t>
       </w:r>
-      <w:proofErr w:type="spellEnd"/>
-      <w:r>
-        <w:t xml:space="preserve">, </w:t>
-      </w:r>
-      <w:proofErr w:type="spellStart"/>
-      <w:r>
-        <w:t>Nome_Farmaco</w:t>
-      </w:r>
-      <w:proofErr w:type="spellEnd"/>
-      <w:r>
-        <w:t>)</w:t>
+      <w:r>
+        <w:t>, Nome_Farmaco)</w:t>
       </w:r>
     </w:p>
     <w:p>
@@ -1596,71 +1486,41 @@
       <w:r>
         <w:t>(</w:t>
       </w:r>
-      <w:proofErr w:type="spellStart"/>
       <w:r>
         <w:rPr>
           <w:u w:val="single"/>
         </w:rPr>
         <w:t>ID_Prescrizione</w:t>
       </w:r>
-      <w:proofErr w:type="spellEnd"/>
       <w:r>
         <w:t xml:space="preserve">, </w:t>
       </w:r>
-      <w:proofErr w:type="spellStart"/>
       <w:r>
         <w:rPr>
           <w:u w:val="single"/>
         </w:rPr>
         <w:t>ID_Paziente</w:t>
       </w:r>
-      <w:proofErr w:type="spellEnd"/>
       <w:r>
         <w:t xml:space="preserve">, </w:t>
       </w:r>
-      <w:proofErr w:type="spellStart"/>
       <w:r>
         <w:rPr>
           <w:u w:val="single"/>
         </w:rPr>
-        <w:t>ID_Medico</w:t>
-      </w:r>
-      <w:proofErr w:type="spellEnd"/>
+        <w:t>ID_Medico,</w:t>
+      </w:r>
+      <w:r>
+        <w:t xml:space="preserve"> </w:t>
+      </w:r>
       <w:r>
         <w:rPr>
           <w:u w:val="single"/>
         </w:rPr>
-        <w:t>,</w:t>
-      </w:r>
-      <w:r>
-        <w:t xml:space="preserve"> </w:t>
-      </w:r>
-      <w:proofErr w:type="spellStart"/>
-      <w:r>
-        <w:rPr>
-          <w:u w:val="single"/>
-        </w:rPr>
         <w:t>Codice_AIC</w:t>
       </w:r>
-      <w:proofErr w:type="spellEnd"/>
-      <w:r>
-        <w:t xml:space="preserve">, </w:t>
-      </w:r>
-      <w:proofErr w:type="spellStart"/>
-      <w:r>
-        <w:t>Data_Emissione</w:t>
-      </w:r>
-      <w:proofErr w:type="spellEnd"/>
-      <w:r>
-        <w:t xml:space="preserve">, </w:t>
-      </w:r>
-      <w:proofErr w:type="spellStart"/>
-      <w:r>
-        <w:t>Quantita</w:t>
-      </w:r>
-      <w:proofErr w:type="spellEnd"/>
-      <w:r>
-        <w:t>, Dettaglio</w:t>
+      <w:r>
+        <w:t>, Data_Emissione, Quantita, Dettaglio</w:t>
       </w:r>
       <w:r>
         <w:t>, Organizzazione</w:t>
@@ -1688,24 +1548,50 @@
           <w:i/>
           <w:iCs/>
         </w:rPr>
-        <w:t xml:space="preserve">-- DROP DATABASE IF EXISTS </w:t>
-      </w:r>
-      <w:proofErr w:type="spellStart"/>
+        <w:t>-- DROP DATABASE IF EXISTS Azienda_Ospedaliera;</w:t>
+      </w:r>
+    </w:p>
+    <w:p>
+      <w:pPr>
+        <w:spacing w:after="0"/>
+      </w:pPr>
       <w:r>
         <w:rPr>
           <w:i/>
           <w:iCs/>
         </w:rPr>
-        <w:t>Azienda_Ospedaliera</w:t>
-      </w:r>
-      <w:proofErr w:type="spellEnd"/>
+        <w:t>-- Creazione Database</w:t>
+      </w:r>
+    </w:p>
+    <w:p>
+      <w:pPr>
+        <w:spacing w:after="0"/>
+      </w:pPr>
       <w:r>
         <w:rPr>
           <w:i/>
           <w:iCs/>
         </w:rPr>
-        <w:t>;</w:t>
-      </w:r>
+        <w:t>CREATE DATABASE Azienda_Ospedaliera;</w:t>
+      </w:r>
+    </w:p>
+    <w:p>
+      <w:pPr>
+        <w:spacing w:after="0"/>
+      </w:pPr>
+    </w:p>
+    <w:p>
+      <w:pPr>
+        <w:spacing w:after="0"/>
+      </w:pPr>
+      <w:r>
+        <w:t>DROP TABLE IF EXISTS Pazienti, Medici, Farmaci, Prescrizioni CASCADE;</w:t>
+      </w:r>
+    </w:p>
+    <w:p>
+      <w:pPr>
+        <w:spacing w:after="0"/>
+      </w:pPr>
     </w:p>
     <w:p>
       <w:pPr>
@@ -1716,8 +1602,63 @@
           <w:i/>
           <w:iCs/>
         </w:rPr>
-        <w:t>-- Creazione Database</w:t>
-      </w:r>
+        <w:t>-- Creazione Tabella Pazienti</w:t>
+      </w:r>
+    </w:p>
+    <w:p>
+      <w:pPr>
+        <w:spacing w:after="0"/>
+      </w:pPr>
+      <w:r>
+        <w:t>CREATE TABLE Pazienti (</w:t>
+      </w:r>
+    </w:p>
+    <w:p>
+      <w:pPr>
+        <w:spacing w:after="0"/>
+      </w:pPr>
+      <w:r>
+        <w:t>    Codice_Fiscale CHAR(16) PRIMARY KEY,</w:t>
+      </w:r>
+    </w:p>
+    <w:p>
+      <w:pPr>
+        <w:spacing w:after="0"/>
+      </w:pPr>
+      <w:r>
+        <w:t>    Nome VARCHAR(100) NOT NULL,</w:t>
+      </w:r>
+    </w:p>
+    <w:p>
+      <w:pPr>
+        <w:spacing w:after="0"/>
+      </w:pPr>
+      <w:r>
+        <w:t>    Cognome VARCHAR(100) NOT NULL</w:t>
+      </w:r>
+    </w:p>
+    <w:p>
+      <w:pPr>
+        <w:spacing w:after="0"/>
+      </w:pPr>
+      <w:r>
+        <w:t>);</w:t>
+      </w:r>
+    </w:p>
+    <w:p>
+      <w:pPr>
+        <w:spacing w:after="0"/>
+      </w:pPr>
+    </w:p>
+    <w:p>
+      <w:pPr>
+        <w:spacing w:after="0"/>
+      </w:pPr>
+    </w:p>
+    <w:p>
+      <w:pPr>
+        <w:spacing w:after="0"/>
+      </w:pPr>
     </w:p>
     <w:p>
       <w:pPr>
@@ -1728,417 +1669,265 @@
           <w:i/>
           <w:iCs/>
         </w:rPr>
-        <w:t xml:space="preserve">CREATE DATABASE </w:t>
-      </w:r>
-      <w:proofErr w:type="spellStart"/>
+        <w:lastRenderedPageBreak/>
+        <w:t>-- Creazione Tabella Medici</w:t>
+      </w:r>
+    </w:p>
+    <w:p>
+      <w:pPr>
+        <w:spacing w:after="0"/>
+      </w:pPr>
+      <w:r>
+        <w:t>CREATE TABLE Medici (</w:t>
+      </w:r>
+    </w:p>
+    <w:p>
+      <w:pPr>
+        <w:spacing w:after="0"/>
+      </w:pPr>
+      <w:r>
+        <w:t>    ID_Medico VARCHAR(50) PRIMARY KEY,</w:t>
+      </w:r>
+    </w:p>
+    <w:p>
+      <w:pPr>
+        <w:spacing w:after="0"/>
+      </w:pPr>
+      <w:r>
+        <w:t>    Nome VARCHAR(100) NOT NULL,</w:t>
+      </w:r>
+    </w:p>
+    <w:p>
+      <w:pPr>
+        <w:spacing w:after="0"/>
+      </w:pPr>
+      <w:r>
+        <w:t>    Cognome VARCHAR(100) NOT NULL</w:t>
+      </w:r>
+    </w:p>
+    <w:p>
+      <w:pPr>
+        <w:spacing w:after="0"/>
+      </w:pPr>
+      <w:r>
+        <w:t>);</w:t>
+      </w:r>
+    </w:p>
+    <w:p>
+      <w:pPr>
+        <w:spacing w:after="0"/>
+      </w:pPr>
+    </w:p>
+    <w:p>
+      <w:pPr>
+        <w:spacing w:after="0"/>
+      </w:pPr>
       <w:r>
         <w:rPr>
           <w:i/>
           <w:iCs/>
         </w:rPr>
-        <w:t>Azienda_Ospedaliera</w:t>
-      </w:r>
-      <w:proofErr w:type="spellEnd"/>
+        <w:t>-- Creazione Tabella Farmaci</w:t>
+      </w:r>
+    </w:p>
+    <w:p>
+      <w:pPr>
+        <w:spacing w:after="0"/>
+      </w:pPr>
+      <w:r>
+        <w:t>CREATE TABLE Farmaci (</w:t>
+      </w:r>
+    </w:p>
+    <w:p>
+      <w:pPr>
+        <w:spacing w:after="0"/>
+      </w:pPr>
+      <w:r>
+        <w:t>    Codice_AIC VARCHAR(20) PRIMARY KEY,</w:t>
+      </w:r>
+    </w:p>
+    <w:p>
+      <w:pPr>
+        <w:spacing w:after="0"/>
+      </w:pPr>
+      <w:r>
+        <w:t>    Nome_Farmaco VARCHAR(255) NOT NULL</w:t>
+      </w:r>
+    </w:p>
+    <w:p>
+      <w:pPr>
+        <w:spacing w:after="0"/>
+      </w:pPr>
+      <w:r>
+        <w:t>);</w:t>
+      </w:r>
+    </w:p>
+    <w:p>
+      <w:pPr>
+        <w:spacing w:after="0"/>
+      </w:pPr>
+    </w:p>
+    <w:p>
+      <w:pPr>
+        <w:spacing w:after="0"/>
+      </w:pPr>
       <w:r>
         <w:rPr>
           <w:i/>
           <w:iCs/>
         </w:rPr>
-        <w:t>;</w:t>
-      </w:r>
-    </w:p>
-    <w:p>
-      <w:pPr>
-        <w:spacing w:after="0"/>
-      </w:pPr>
-    </w:p>
-    <w:p>
-      <w:pPr>
-        <w:spacing w:after="0"/>
-      </w:pPr>
-      <w:r>
-        <w:t>DROP TABLE IF EXISTS Pazienti, Medici, Farmaci, Prescrizioni CASCADE;</w:t>
-      </w:r>
-    </w:p>
-    <w:p>
-      <w:pPr>
-        <w:spacing w:after="0"/>
-      </w:pPr>
-    </w:p>
-    <w:p>
-      <w:pPr>
-        <w:spacing w:after="0"/>
-      </w:pPr>
+        <w:t>-- Creazione Tabella Prescrizioni</w:t>
+      </w:r>
+    </w:p>
+    <w:p>
+      <w:pPr>
+        <w:spacing w:after="0"/>
+      </w:pPr>
+      <w:r>
+        <w:t>CREATE TABLE Prescrizioni (</w:t>
+      </w:r>
+    </w:p>
+    <w:p>
+      <w:pPr>
+        <w:spacing w:after="0"/>
+      </w:pPr>
+      <w:r>
+        <w:t>    ID_Prescrizione VARCHAR(50) PRIMARY KEY,</w:t>
+      </w:r>
+    </w:p>
+    <w:p>
+      <w:pPr>
+        <w:spacing w:after="0"/>
+      </w:pPr>
+      <w:r>
+        <w:t>    Codice_Fiscale CHAR(16) NOT NULL,</w:t>
+      </w:r>
+    </w:p>
+    <w:p>
+      <w:pPr>
+        <w:spacing w:after="0"/>
+      </w:pPr>
+      <w:r>
+        <w:t>    ID_Medico VARCHAR(50) NOT NULL,</w:t>
+      </w:r>
+    </w:p>
+    <w:p>
+      <w:pPr>
+        <w:spacing w:after="0"/>
+      </w:pPr>
+      <w:r>
+        <w:t>    Codice_AIC VARCHAR(20) NOT NULL,</w:t>
+      </w:r>
+    </w:p>
+    <w:p>
+      <w:pPr>
+        <w:spacing w:after="0"/>
+      </w:pPr>
+      <w:r>
+        <w:t>    Data_Emissione DATE NOT NULL,</w:t>
+      </w:r>
+    </w:p>
+    <w:p>
+      <w:pPr>
+        <w:spacing w:after="0"/>
+      </w:pPr>
+      <w:r>
+        <w:t>    Quantita INT NOT NULL,</w:t>
+      </w:r>
+    </w:p>
+    <w:p>
+      <w:pPr>
+        <w:spacing w:after="0"/>
+      </w:pPr>
+      <w:r>
+        <w:t>    Dettaglio TEXT NOT NULL,</w:t>
+      </w:r>
+    </w:p>
+    <w:p>
+      <w:pPr>
+        <w:spacing w:after="0"/>
+      </w:pPr>
+      <w:r>
+        <w:t>    Organizzazione VARCHAR(255) NOT NULL,</w:t>
+      </w:r>
+    </w:p>
+    <w:p>
+      <w:pPr>
+        <w:spacing w:after="0"/>
+      </w:pPr>
+      <w:r>
+        <w:t xml:space="preserve">    </w:t>
+      </w:r>
       <w:r>
         <w:rPr>
           <w:i/>
           <w:iCs/>
         </w:rPr>
-        <w:t>-- Creazione Tabella Pazienti</w:t>
-      </w:r>
-    </w:p>
-    <w:p>
-      <w:pPr>
-        <w:spacing w:after="0"/>
-      </w:pPr>
-      <w:r>
-        <w:t>CREATE TABLE Pazienti (</w:t>
-      </w:r>
-    </w:p>
-    <w:p>
-      <w:pPr>
-        <w:spacing w:after="0"/>
-      </w:pPr>
-      <w:r>
-        <w:t xml:space="preserve">    </w:t>
-      </w:r>
-      <w:proofErr w:type="spellStart"/>
-      <w:r>
-        <w:t>ID_Paziente</w:t>
-      </w:r>
-      <w:proofErr w:type="spellEnd"/>
-      <w:r>
-        <w:t xml:space="preserve"> VARCHAR(50) PRIMARY KEY,</w:t>
-      </w:r>
-    </w:p>
-    <w:p>
-      <w:pPr>
-        <w:spacing w:after="0"/>
-      </w:pPr>
-      <w:r>
-        <w:t xml:space="preserve">    </w:t>
-      </w:r>
-      <w:proofErr w:type="spellStart"/>
-      <w:r>
-        <w:t>Codice_Fiscale</w:t>
-      </w:r>
-      <w:proofErr w:type="spellEnd"/>
-      <w:r>
-        <w:t xml:space="preserve"> CHAR(16) UNIQUE,</w:t>
-      </w:r>
-    </w:p>
-    <w:p>
-      <w:pPr>
-        <w:spacing w:after="0"/>
-      </w:pPr>
-      <w:r>
-        <w:t>    Nome VARCHAR(100) NOT NULL,</w:t>
-      </w:r>
-    </w:p>
-    <w:p>
-      <w:pPr>
-        <w:spacing w:after="0"/>
-      </w:pPr>
-      <w:r>
-        <w:t>    Cognome VARCHAR(100) NOT NULL</w:t>
-      </w:r>
-    </w:p>
-    <w:p>
-      <w:pPr>
-        <w:spacing w:after="0"/>
-      </w:pPr>
-      <w:r>
-        <w:t>);</w:t>
-      </w:r>
-    </w:p>
-    <w:p>
-      <w:pPr>
-        <w:spacing w:after="0"/>
-      </w:pPr>
+        <w:t>-- Definizione dei vincoli di chiave esterna (Foreign Keys)</w:t>
+      </w:r>
+    </w:p>
+    <w:p>
+      <w:pPr>
+        <w:spacing w:after="0"/>
+      </w:pPr>
+      <w:r>
+        <w:t xml:space="preserve">    FOREIGN KEY (Codice_Fiscale) </w:t>
+      </w:r>
       <w:r>
         <w:rPr>
           <w:i/>
           <w:iCs/>
         </w:rPr>
-        <w:t>-- Creazione Tabella Medici</w:t>
-      </w:r>
-    </w:p>
-    <w:p>
-      <w:pPr>
-        <w:spacing w:after="0"/>
-      </w:pPr>
-      <w:r>
-        <w:t>CREATE TABLE Medici (</w:t>
-      </w:r>
-    </w:p>
-    <w:p>
-      <w:pPr>
-        <w:spacing w:after="0"/>
-      </w:pPr>
-      <w:r>
-        <w:lastRenderedPageBreak/>
-        <w:t xml:space="preserve">    </w:t>
-      </w:r>
-      <w:proofErr w:type="spellStart"/>
-      <w:r>
-        <w:t>ID_Medico</w:t>
-      </w:r>
-      <w:proofErr w:type="spellEnd"/>
-      <w:r>
-        <w:t xml:space="preserve"> VARCHAR(50) PRIMARY KEY,</w:t>
-      </w:r>
-    </w:p>
-    <w:p>
-      <w:pPr>
-        <w:spacing w:after="0"/>
-      </w:pPr>
-      <w:r>
-        <w:t>    Nome VARCHAR(100) NOT NULL,</w:t>
-      </w:r>
-    </w:p>
-    <w:p>
-      <w:pPr>
-        <w:spacing w:after="0"/>
-      </w:pPr>
-      <w:r>
-        <w:t>    Cognome VARCHAR(100) NOT NULL</w:t>
-      </w:r>
-    </w:p>
-    <w:p>
-      <w:pPr>
-        <w:spacing w:after="0"/>
-      </w:pPr>
-      <w:r>
-        <w:t>);</w:t>
-      </w:r>
-    </w:p>
-    <w:p>
-      <w:pPr>
-        <w:spacing w:after="0"/>
-      </w:pPr>
-    </w:p>
-    <w:p>
-      <w:pPr>
-        <w:spacing w:after="0"/>
-        <w:rPr>
-          <w:u w:val="single"/>
-        </w:rPr>
-      </w:pPr>
+        <w:t>REFERENCES</w:t>
+      </w:r>
+      <w:r>
+        <w:t xml:space="preserve"> Pazienti(Codice_Fiscale) </w:t>
+      </w:r>
       <w:r>
         <w:rPr>
           <w:i/>
           <w:iCs/>
         </w:rPr>
-        <w:t>-- Creazione Tabella Farmaci</w:t>
-      </w:r>
-    </w:p>
-    <w:p>
-      <w:pPr>
-        <w:spacing w:after="0"/>
-      </w:pPr>
-      <w:r>
-        <w:t>CREATE TABLE Farmaci (</w:t>
-      </w:r>
-    </w:p>
-    <w:p>
-      <w:pPr>
-        <w:spacing w:after="0"/>
-      </w:pPr>
-      <w:r>
-        <w:t xml:space="preserve">    </w:t>
-      </w:r>
-      <w:proofErr w:type="spellStart"/>
-      <w:r>
-        <w:t>Codice_AIC</w:t>
-      </w:r>
-      <w:proofErr w:type="spellEnd"/>
-      <w:r>
-        <w:t xml:space="preserve"> VARCHAR(20) PRIMARY KEY,</w:t>
-      </w:r>
-    </w:p>
-    <w:p>
-      <w:pPr>
-        <w:spacing w:after="0"/>
-      </w:pPr>
-      <w:r>
-        <w:t xml:space="preserve">    </w:t>
-      </w:r>
-      <w:proofErr w:type="spellStart"/>
-      <w:r>
-        <w:t>Nome_Farmaco</w:t>
-      </w:r>
-      <w:proofErr w:type="spellEnd"/>
-      <w:r>
-        <w:t xml:space="preserve"> VARCHAR(255) NOT NULL</w:t>
-      </w:r>
-    </w:p>
-    <w:p>
-      <w:pPr>
-        <w:spacing w:after="0"/>
-      </w:pPr>
-      <w:r>
-        <w:t>);</w:t>
-      </w:r>
-    </w:p>
-    <w:p>
-      <w:pPr>
-        <w:spacing w:after="0"/>
-      </w:pPr>
-    </w:p>
-    <w:p>
-      <w:pPr>
-        <w:spacing w:after="0"/>
-        <w:rPr>
-          <w:u w:val="single"/>
-        </w:rPr>
-      </w:pPr>
+        <w:t>ON DELETE CASCADE</w:t>
+      </w:r>
+      <w:r>
+        <w:t>,</w:t>
+      </w:r>
+    </w:p>
+    <w:p>
+      <w:pPr>
+        <w:spacing w:after="0"/>
+      </w:pPr>
+      <w:r>
+        <w:t xml:space="preserve">    FOREIGN KEY (ID_Medico) </w:t>
+      </w:r>
       <w:r>
         <w:rPr>
           <w:i/>
           <w:iCs/>
         </w:rPr>
-        <w:t>-- Creazione Tabella Prescrizioni</w:t>
-      </w:r>
-    </w:p>
-    <w:p>
-      <w:pPr>
-        <w:spacing w:after="0"/>
-      </w:pPr>
-      <w:r>
-        <w:t>CREATE TABLE Prescrizioni (</w:t>
-      </w:r>
-    </w:p>
-    <w:p>
-      <w:pPr>
-        <w:spacing w:after="0"/>
-      </w:pPr>
-      <w:r>
-        <w:t xml:space="preserve">    </w:t>
-      </w:r>
-      <w:proofErr w:type="spellStart"/>
-      <w:r>
-        <w:t>ID_Prescrizione</w:t>
-      </w:r>
-      <w:proofErr w:type="spellEnd"/>
-      <w:r>
-        <w:t xml:space="preserve"> VARCHAR(50) PRIMARY KEY,</w:t>
-      </w:r>
-    </w:p>
-    <w:p>
-      <w:pPr>
-        <w:spacing w:after="0"/>
-      </w:pPr>
-      <w:r>
-        <w:t xml:space="preserve">    </w:t>
-      </w:r>
-      <w:proofErr w:type="spellStart"/>
-      <w:r>
-        <w:t>ID_Paziente</w:t>
-      </w:r>
-      <w:proofErr w:type="spellEnd"/>
-      <w:r>
-        <w:t xml:space="preserve"> VARCHAR(50) NOT NULL,</w:t>
-      </w:r>
-    </w:p>
-    <w:p>
-      <w:pPr>
-        <w:spacing w:after="0"/>
-      </w:pPr>
-      <w:r>
-        <w:t xml:space="preserve">    </w:t>
-      </w:r>
-      <w:proofErr w:type="spellStart"/>
-      <w:r>
-        <w:t>ID_Medico</w:t>
-      </w:r>
-      <w:proofErr w:type="spellEnd"/>
-      <w:r>
-        <w:t xml:space="preserve"> VARCHAR(50) NOT NULL,</w:t>
-      </w:r>
-    </w:p>
-    <w:p>
-      <w:pPr>
-        <w:spacing w:after="0"/>
-      </w:pPr>
-      <w:r>
-        <w:t xml:space="preserve">    </w:t>
-      </w:r>
-      <w:proofErr w:type="spellStart"/>
-      <w:r>
-        <w:t>Codice_AIC</w:t>
-      </w:r>
-      <w:proofErr w:type="spellEnd"/>
-      <w:r>
-        <w:t xml:space="preserve"> VARCHAR(20) NOT NULL,</w:t>
-      </w:r>
-    </w:p>
-    <w:p>
-      <w:pPr>
-        <w:spacing w:after="0"/>
-      </w:pPr>
-      <w:r>
-        <w:t xml:space="preserve">    </w:t>
-      </w:r>
-      <w:proofErr w:type="spellStart"/>
-      <w:r>
-        <w:t>Data_Emissione</w:t>
-      </w:r>
-      <w:proofErr w:type="spellEnd"/>
-      <w:r>
-        <w:t xml:space="preserve"> DATE NOT NULL,</w:t>
-      </w:r>
-    </w:p>
-    <w:p>
-      <w:pPr>
-        <w:spacing w:after="0"/>
-      </w:pPr>
-      <w:r>
-        <w:t xml:space="preserve">    </w:t>
-      </w:r>
-      <w:proofErr w:type="spellStart"/>
-      <w:r>
-        <w:t>Quantita</w:t>
-      </w:r>
-      <w:proofErr w:type="spellEnd"/>
-      <w:r>
-        <w:t xml:space="preserve"> INT NOT NULL,</w:t>
-      </w:r>
-    </w:p>
-    <w:p>
-      <w:pPr>
-        <w:spacing w:after="0"/>
-      </w:pPr>
-      <w:r>
-        <w:t>    Dettaglio TEXT NOT NULL,</w:t>
-      </w:r>
-    </w:p>
-    <w:p>
-      <w:pPr>
-        <w:spacing w:after="0"/>
-      </w:pPr>
-      <w:r>
-        <w:t>    Organizzazione VARCHAR(255) NOT NULL,</w:t>
-      </w:r>
-    </w:p>
-    <w:p>
-      <w:pPr>
-        <w:spacing w:after="0"/>
-      </w:pPr>
-      <w:r>
-        <w:t xml:space="preserve">    </w:t>
+        <w:t>REFERENCES</w:t>
+      </w:r>
+      <w:r>
+        <w:t xml:space="preserve"> Medici(ID_Medico) </w:t>
       </w:r>
       <w:r>
         <w:rPr>
           <w:i/>
           <w:iCs/>
         </w:rPr>
-        <w:t>-- Definizione dei vincoli di chiave esterna (Foreign Keys)</w:t>
-      </w:r>
-    </w:p>
-    <w:p>
-      <w:pPr>
-        <w:spacing w:after="0"/>
-      </w:pPr>
-      <w:r>
-        <w:t>    FOREIGN KEY (</w:t>
-      </w:r>
-      <w:proofErr w:type="spellStart"/>
-      <w:r>
-        <w:t>ID_Paziente</w:t>
-      </w:r>
-      <w:proofErr w:type="spellEnd"/>
-      <w:r>
-        <w:t xml:space="preserve">) </w:t>
+        <w:t>ON DELETE CASCADE</w:t>
+      </w:r>
+      <w:r>
+        <w:t>,</w:t>
+      </w:r>
+    </w:p>
+    <w:p>
+      <w:pPr>
+        <w:spacing w:after="0"/>
+      </w:pPr>
+      <w:r>
+        <w:t xml:space="preserve">    FOREIGN KEY (Codice_AIC) </w:t>
       </w:r>
       <w:r>
         <w:rPr>
@@ -2148,15 +1937,7 @@
         <w:t>REFERENCES</w:t>
       </w:r>
       <w:r>
-        <w:t xml:space="preserve"> Pazienti(</w:t>
-      </w:r>
-      <w:proofErr w:type="spellStart"/>
-      <w:r>
-        <w:t>ID_Paziente</w:t>
-      </w:r>
-      <w:proofErr w:type="spellEnd"/>
-      <w:r>
-        <w:t xml:space="preserve">) </w:t>
+        <w:t xml:space="preserve"> Farmaci(Codice_AIC) </w:t>
       </w:r>
       <w:r>
         <w:rPr>
@@ -2165,101 +1946,274 @@
         </w:rPr>
         <w:t>ON DELETE CASCADE</w:t>
       </w:r>
-      <w:r>
-        <w:t>,</w:t>
-      </w:r>
-    </w:p>
-    <w:p>
-      <w:pPr>
-        <w:spacing w:after="0"/>
-      </w:pPr>
-      <w:r>
-        <w:t>    FOREIGN KEY (</w:t>
-      </w:r>
-      <w:proofErr w:type="spellStart"/>
-      <w:r>
-        <w:t>ID_Medico</w:t>
-      </w:r>
-      <w:proofErr w:type="spellEnd"/>
-      <w:r>
-        <w:t xml:space="preserve">) </w:t>
-      </w:r>
+    </w:p>
+    <w:p>
+      <w:pPr>
+        <w:spacing w:after="0"/>
+      </w:pPr>
+      <w:r>
+        <w:t>);</w:t>
+      </w:r>
+    </w:p>
+    <w:p>
+      <w:pPr>
+        <w:spacing w:after="0"/>
+      </w:pPr>
+    </w:p>
+    <w:p>
+      <w:pPr>
+        <w:spacing w:after="0"/>
+      </w:pPr>
       <w:r>
         <w:rPr>
           <w:i/>
           <w:iCs/>
         </w:rPr>
-        <w:t>REFERENCES</w:t>
-      </w:r>
-      <w:r>
-        <w:t xml:space="preserve"> Medici(</w:t>
-      </w:r>
-      <w:proofErr w:type="spellStart"/>
-      <w:r>
-        <w:t>ID_Medico</w:t>
-      </w:r>
-      <w:proofErr w:type="spellEnd"/>
-      <w:r>
-        <w:t xml:space="preserve">) </w:t>
-      </w:r>
+        <w:t>-- Inserimento dei pazienti</w:t>
+      </w:r>
+    </w:p>
+    <w:p>
+      <w:pPr>
+        <w:spacing w:after="0"/>
+      </w:pPr>
+      <w:r>
+        <w:t xml:space="preserve">INSERT INTO Pazienti (Codice_Fiscale, Nome, Cognome) </w:t>
+      </w:r>
+    </w:p>
+    <w:p>
+      <w:pPr>
+        <w:spacing w:after="0"/>
+      </w:pPr>
+      <w:r>
+        <w:t>VALUES ('VRDLGU80M15H501Z', 'Luigi', 'Verdi'),</w:t>
+      </w:r>
+    </w:p>
+    <w:p>
+      <w:pPr>
+        <w:spacing w:after="0"/>
+      </w:pPr>
+      <w:r>
+        <w:t>('RSSMRA80A01H501U', 'Mario', 'Rossi'),</w:t>
+      </w:r>
+    </w:p>
+    <w:p>
+      <w:pPr>
+        <w:spacing w:after="0"/>
+      </w:pPr>
+      <w:r>
+        <w:t>('BNCGNN75T10F205A', 'Giovanni', 'Bianchi'),</w:t>
+      </w:r>
+    </w:p>
+    <w:p>
+      <w:pPr>
+        <w:spacing w:after="0"/>
+      </w:pPr>
+      <w:r>
+        <w:t>('FRRLRA92A01H501F', 'Laura', 'Ferrari');</w:t>
+      </w:r>
+    </w:p>
+    <w:p>
+      <w:pPr>
+        <w:spacing w:after="0"/>
+      </w:pPr>
+    </w:p>
+    <w:p>
+      <w:pPr>
+        <w:spacing w:after="0"/>
+      </w:pPr>
       <w:r>
         <w:rPr>
           <w:i/>
           <w:iCs/>
         </w:rPr>
-        <w:t>ON DELETE CASCADE</w:t>
-      </w:r>
-      <w:r>
-        <w:t>,</w:t>
-      </w:r>
-    </w:p>
-    <w:p>
-      <w:pPr>
-        <w:spacing w:after="0"/>
-      </w:pPr>
-      <w:r>
-        <w:t>    FOREIGN KEY (</w:t>
-      </w:r>
-      <w:proofErr w:type="spellStart"/>
-      <w:r>
-        <w:t>Codice_AIC</w:t>
-      </w:r>
-      <w:proofErr w:type="spellEnd"/>
-      <w:r>
-        <w:t xml:space="preserve">) </w:t>
-      </w:r>
+        <w:t>-- Inserimento medico</w:t>
+      </w:r>
+    </w:p>
+    <w:p>
+      <w:pPr>
+        <w:spacing w:after="0"/>
+      </w:pPr>
+      <w:r>
+        <w:t xml:space="preserve">INSERT INTO Medici (ID_Medico, Nome, Cognome) </w:t>
+      </w:r>
+    </w:p>
+    <w:p>
+      <w:pPr>
+        <w:spacing w:after="0"/>
+      </w:pPr>
+      <w:r>
+        <w:t>VALUES ('MED-120101', 'Mario', 'Bianchi'),</w:t>
+      </w:r>
+    </w:p>
+    <w:p>
+      <w:pPr>
+        <w:spacing w:after="0"/>
+      </w:pPr>
+      <w:r>
+        <w:t>('MED-120102', 'Elena', 'Russo');</w:t>
+      </w:r>
+    </w:p>
+    <w:p>
+      <w:pPr>
+        <w:spacing w:after="0"/>
+      </w:pPr>
+    </w:p>
+    <w:p>
+      <w:pPr>
+        <w:spacing w:after="0"/>
+      </w:pPr>
       <w:r>
         <w:rPr>
           <w:i/>
           <w:iCs/>
         </w:rPr>
-        <w:t>REFERENCES</w:t>
-      </w:r>
-      <w:r>
-        <w:t xml:space="preserve"> Farmaci(</w:t>
-      </w:r>
-      <w:proofErr w:type="spellStart"/>
-      <w:r>
-        <w:t>Codice_AIC</w:t>
-      </w:r>
-      <w:proofErr w:type="spellEnd"/>
-      <w:r>
-        <w:t xml:space="preserve">) </w:t>
-      </w:r>
+        <w:t>-- Inserimento farmaco</w:t>
+      </w:r>
+    </w:p>
+    <w:p>
+      <w:pPr>
+        <w:spacing w:after="0"/>
+      </w:pPr>
+      <w:r>
+        <w:t xml:space="preserve">INSERT INTO Farmaci (Codice_AIC, Nome_Farmaco) </w:t>
+      </w:r>
+    </w:p>
+    <w:p>
+      <w:pPr>
+        <w:spacing w:after="0"/>
+      </w:pPr>
+      <w:r>
+        <w:t>VALUES ('012745098', 'TACHIPIRINA*10CPR RIV 1000MG'),</w:t>
+      </w:r>
+    </w:p>
+    <w:p>
+      <w:pPr>
+        <w:spacing w:after="0"/>
+      </w:pPr>
+      <w:r>
+        <w:t>('035154035', 'AUGMENTIN*12CPR RIV 875MG+125MG'),</w:t>
+      </w:r>
+    </w:p>
+    <w:p>
+      <w:pPr>
+        <w:spacing w:after="0"/>
+      </w:pPr>
+      <w:r>
+        <w:t>('025218041', 'OKI*30BUST 80MG'),</w:t>
+      </w:r>
+    </w:p>
+    <w:p>
+      <w:pPr>
+        <w:spacing w:after="0"/>
+      </w:pPr>
+      <w:r>
+        <w:t>('031835012', 'BRUFEN*30CPR RIV 600MG');</w:t>
+      </w:r>
+    </w:p>
+    <w:p>
+      <w:pPr>
+        <w:spacing w:after="0"/>
+      </w:pPr>
+    </w:p>
+    <w:p>
+      <w:pPr>
+        <w:spacing w:after="0"/>
+      </w:pPr>
       <w:r>
         <w:rPr>
           <w:i/>
           <w:iCs/>
         </w:rPr>
-        <w:t>ON DELETE CASCADE</w:t>
-      </w:r>
-    </w:p>
-    <w:p>
-      <w:pPr>
-        <w:spacing w:after="0"/>
-      </w:pPr>
-      <w:r>
-        <w:t>);</w:t>
+        <w:lastRenderedPageBreak/>
+        <w:t>-- Inserimento Prescrizione</w:t>
+      </w:r>
+    </w:p>
+    <w:p>
+      <w:pPr>
+        <w:spacing w:after="0"/>
+      </w:pPr>
+      <w:r>
+        <w:t xml:space="preserve">INSERT INTO Prescrizioni (ID_Prescrizione, Codice_Fiscale, ID_Medico, Codice_AIC, Data_Emissione, Quantita, Dettaglio, Organizzazione) </w:t>
+      </w:r>
+    </w:p>
+    <w:p>
+      <w:pPr>
+        <w:spacing w:after="0"/>
+      </w:pPr>
+      <w:r>
+        <w:t>VALUES ('PRF-2026-9999', 'RSSMRA80A01H501U', 'MED-120101', '012745098', '2026-05-11', 1, 'Paracetamolo 1000mg, 1 conf', 'Sistema TS'),</w:t>
+      </w:r>
+    </w:p>
+    <w:p>
+      <w:pPr>
+        <w:spacing w:after="0"/>
+      </w:pPr>
+      <w:r>
+        <w:t>('PRF-2026-0001', 'RSSMRA80A01H501U', 'MED-120101', '012745098', '2026-05-12', 2, 'Tachipirina 1000mg, 2 confezioni - Trattamento iperpiressia', 'Sistema TS'),</w:t>
+      </w:r>
+    </w:p>
+    <w:p>
+      <w:pPr>
+        <w:spacing w:after="0"/>
+      </w:pPr>
+      <w:r>
+        <w:t>('PRF-2026-0002', 'VRDLGU80M15H501Z', 'MED-120101', '035154035', '2026-05-13', 1, 'Augmentin compresse, 1 confezione - Terapia antibiotica', 'Sistema TS'),</w:t>
+      </w:r>
+    </w:p>
+    <w:p>
+      <w:pPr>
+        <w:spacing w:after="0"/>
+      </w:pPr>
+      <w:r>
+        <w:t>('PRF-2026-0003', 'BNCGNN75T10F205A', 'MED-120101', '025218041', '2026-05-14', 1, 'Oki bustine, 1 confezione per cefalea tensiva', 'Sistema TS'),</w:t>
+      </w:r>
+    </w:p>
+    <w:p>
+      <w:pPr>
+        <w:spacing w:after="0"/>
+      </w:pPr>
+      <w:r>
+        <w:t>('PRF-2026-0004', 'FRRLRA92A01H501F', 'MED-120101', '031835012', '2026-05-15', 1, 'Brufen 600mg, 1 confezione per algie articolari', 'Sistema TS'),</w:t>
+      </w:r>
+    </w:p>
+    <w:p>
+      <w:pPr>
+        <w:spacing w:after="0"/>
+      </w:pPr>
+      <w:r>
+        <w:t>('PRF-2026-0005', 'RSSMRA80A01H501U', 'MED-120101', '035154035', '2026-05-16', 1, 'Augmentin compresse, 1 confezione - Terapia di follow-up', 'Sistema TS'),</w:t>
+      </w:r>
+    </w:p>
+    <w:p>
+      <w:pPr>
+        <w:spacing w:after="0"/>
+      </w:pPr>
+      <w:r>
+        <w:t>('PRF-2026-0006', 'VRDLGU80M15H501Z', 'MED-120102', '012745098', '2026-05-17', 1, 'Tachipirina 1000mg, 1 confezione al bisogno', 'Sistema TS'),</w:t>
+      </w:r>
+    </w:p>
+    <w:p>
+      <w:pPr>
+        <w:spacing w:after="0"/>
+      </w:pPr>
+      <w:r>
+        <w:t>('PRF-2026-0007', 'BNCGNN75T10F205A', 'MED-120102', '025218041', '2026-05-18', 2, 'Oki 80mg bustine, 2 confezioni - Trattamento antinfiammatorio', 'Sistema TS'),</w:t>
+      </w:r>
+    </w:p>
+    <w:p>
+      <w:pPr>
+        <w:spacing w:after="0"/>
+      </w:pPr>
+      <w:r>
+        <w:t>('PRF-2026-0008', 'FRRLRA92A01H501F', 'MED-120102', '031835012', '2026-05-19', 1, 'Brufen 600mg, 1 confezione post-estrattiva', 'Sistema TS'),</w:t>
+      </w:r>
+    </w:p>
+    <w:p>
+      <w:pPr>
+        <w:spacing w:after="0"/>
+      </w:pPr>
+      <w:r>
+        <w:t>('PRF-2026-0009', 'RSSMRA80A01H501U', 'MED-120102', '012745098', '2026-05-20', 1, 'Paracetamolo 1000mg, 1 conf per stato influenzale', 'Sistema TS');</w:t>
       </w:r>
     </w:p>
     <w:p>
@@ -2276,732 +2230,63 @@
           <w:i/>
           <w:iCs/>
         </w:rPr>
-        <w:t xml:space="preserve">-- Inserimento </w:t>
-      </w:r>
-      <w:r>
-        <w:rPr>
-          <w:i/>
-          <w:iCs/>
-        </w:rPr>
-        <w:t>dati dei</w:t>
-      </w:r>
-      <w:r>
-        <w:rPr>
-          <w:i/>
-          <w:iCs/>
-        </w:rPr>
-        <w:t xml:space="preserve"> pazient</w:t>
-      </w:r>
-      <w:r>
-        <w:rPr>
-          <w:i/>
-          <w:iCs/>
-        </w:rPr>
-        <w:t>i</w:t>
-      </w:r>
-    </w:p>
-    <w:p>
-      <w:pPr>
-        <w:spacing w:after="0"/>
-      </w:pPr>
-      <w:r>
-        <w:t>INSERT INTO Pazienti (</w:t>
-      </w:r>
-      <w:proofErr w:type="spellStart"/>
-      <w:r>
-        <w:t>ID_Paziente</w:t>
-      </w:r>
-      <w:proofErr w:type="spellEnd"/>
-      <w:r>
-        <w:t xml:space="preserve">, </w:t>
-      </w:r>
-      <w:proofErr w:type="spellStart"/>
-      <w:r>
-        <w:t>Codice_Fiscale</w:t>
-      </w:r>
-      <w:proofErr w:type="spellEnd"/>
-      <w:r>
-        <w:t xml:space="preserve">, Nome, Cognome) </w:t>
-      </w:r>
-    </w:p>
-    <w:p>
-      <w:pPr>
-        <w:spacing w:after="0"/>
-      </w:pPr>
-      <w:r>
-        <w:t>VALUES ('PT-001', 'VRDLGU80M15H501Z', 'Luigi', '</w:t>
-      </w:r>
-      <w:proofErr w:type="spellStart"/>
-      <w:r>
-        <w:t>Verdi'</w:t>
-      </w:r>
-      <w:proofErr w:type="spellEnd"/>
-      <w:r>
-        <w:t>),</w:t>
-      </w:r>
-    </w:p>
-    <w:p>
-      <w:pPr>
-        <w:spacing w:after="0"/>
-      </w:pPr>
-      <w:r>
-        <w:t>('PT-002', 'RSSMRA80A01H501U', 'Mario', 'Rossi'),</w:t>
-      </w:r>
-    </w:p>
-    <w:p>
-      <w:pPr>
-        <w:spacing w:after="0"/>
-      </w:pPr>
-      <w:r>
-        <w:t>('PT-003', 'BNCGNN75T10F205A', 'Giovanni', '</w:t>
-      </w:r>
-      <w:proofErr w:type="spellStart"/>
-      <w:r>
-        <w:t>Bianchi'</w:t>
-      </w:r>
-      <w:proofErr w:type="spellEnd"/>
-      <w:r>
-        <w:t>),</w:t>
-      </w:r>
-    </w:p>
-    <w:p>
-      <w:pPr>
-        <w:spacing w:after="0"/>
-      </w:pPr>
-      <w:r>
-        <w:t>('PT-004', 'FRRLRA92A01H501F', 'Laura', 'Ferrari');</w:t>
-      </w:r>
-    </w:p>
-    <w:p>
-      <w:pPr>
-        <w:spacing w:after="0"/>
-      </w:pPr>
-    </w:p>
-    <w:p>
-      <w:pPr>
-        <w:spacing w:after="0"/>
-      </w:pPr>
-      <w:r>
-        <w:rPr>
-          <w:i/>
-          <w:iCs/>
-        </w:rPr>
-        <w:t xml:space="preserve">-- Inserimento </w:t>
-      </w:r>
-      <w:r>
-        <w:rPr>
-          <w:i/>
-          <w:iCs/>
-        </w:rPr>
-        <w:t xml:space="preserve">dati dei </w:t>
-      </w:r>
-      <w:r>
-        <w:rPr>
-          <w:i/>
-          <w:iCs/>
-        </w:rPr>
-        <w:t>medic</w:t>
-      </w:r>
-      <w:r>
-        <w:rPr>
-          <w:i/>
-          <w:iCs/>
-        </w:rPr>
-        <w:t>i</w:t>
-      </w:r>
-    </w:p>
-    <w:p>
-      <w:pPr>
-        <w:spacing w:after="0"/>
-      </w:pPr>
-      <w:r>
-        <w:t>INSERT INTO Medici (</w:t>
-      </w:r>
-      <w:proofErr w:type="spellStart"/>
-      <w:r>
-        <w:t>ID_Medico</w:t>
-      </w:r>
-      <w:proofErr w:type="spellEnd"/>
-      <w:r>
-        <w:t xml:space="preserve">, Nome, Cognome) </w:t>
-      </w:r>
-    </w:p>
-    <w:p>
-      <w:pPr>
-        <w:spacing w:after="0"/>
-      </w:pPr>
-      <w:r>
-        <w:t>VALUES ('MED-120101', 'Mario', '</w:t>
-      </w:r>
-      <w:proofErr w:type="spellStart"/>
-      <w:r>
-        <w:t>Bianchi'</w:t>
-      </w:r>
-      <w:proofErr w:type="spellEnd"/>
-      <w:r>
-        <w:t>),</w:t>
-      </w:r>
-    </w:p>
-    <w:p>
-      <w:pPr>
-        <w:spacing w:after="0"/>
-      </w:pPr>
-      <w:r>
-        <w:t>('MED-120102', 'Elena', '</w:t>
-      </w:r>
-      <w:proofErr w:type="spellStart"/>
-      <w:r>
-        <w:t>Russo'</w:t>
-      </w:r>
-      <w:proofErr w:type="spellEnd"/>
-      <w:r>
-        <w:t>);</w:t>
-      </w:r>
-    </w:p>
-    <w:p>
-      <w:pPr>
-        <w:spacing w:after="0"/>
-      </w:pPr>
-    </w:p>
-    <w:p>
-      <w:pPr>
-        <w:spacing w:after="0"/>
-      </w:pPr>
-      <w:r>
-        <w:rPr>
-          <w:i/>
-          <w:iCs/>
-        </w:rPr>
-        <w:t xml:space="preserve">-- Inserimento </w:t>
-      </w:r>
-      <w:r>
-        <w:rPr>
-          <w:i/>
-          <w:iCs/>
-        </w:rPr>
-        <w:t xml:space="preserve">dati dei </w:t>
-      </w:r>
-      <w:r>
-        <w:rPr>
-          <w:i/>
-          <w:iCs/>
-        </w:rPr>
-        <w:t>farmac</w:t>
-      </w:r>
-      <w:r>
-        <w:rPr>
-          <w:i/>
-          <w:iCs/>
-        </w:rPr>
-        <w:t>i</w:t>
-      </w:r>
-    </w:p>
-    <w:p>
-      <w:pPr>
-        <w:spacing w:after="0"/>
-      </w:pPr>
-      <w:r>
-        <w:t>INSERT INTO Farmaci (</w:t>
-      </w:r>
-      <w:proofErr w:type="spellStart"/>
-      <w:r>
-        <w:t>Codice_AIC</w:t>
-      </w:r>
-      <w:proofErr w:type="spellEnd"/>
-      <w:r>
-        <w:t xml:space="preserve">, </w:t>
-      </w:r>
-      <w:proofErr w:type="spellStart"/>
-      <w:r>
-        <w:t>Nome_Farmaco</w:t>
-      </w:r>
-      <w:proofErr w:type="spellEnd"/>
-      <w:r>
-        <w:t xml:space="preserve">) </w:t>
-      </w:r>
-    </w:p>
-    <w:p>
-      <w:pPr>
-        <w:spacing w:after="0"/>
-      </w:pPr>
-      <w:r>
-        <w:t>VALUES ('012745098', 'TACHIPIRINA*10CPR RIV 1000MG'),</w:t>
-      </w:r>
-    </w:p>
-    <w:p>
-      <w:pPr>
-        <w:spacing w:after="0"/>
-      </w:pPr>
-      <w:r>
-        <w:t>('035154035', 'AUGMENTIN*12CPR RIV 875MG+125MG'),</w:t>
-      </w:r>
-    </w:p>
-    <w:p>
-      <w:pPr>
-        <w:spacing w:after="0"/>
-      </w:pPr>
-      <w:r>
-        <w:t>('025218041', 'OKI*30BUST 80MG'),</w:t>
-      </w:r>
-    </w:p>
-    <w:p>
-      <w:pPr>
-        <w:spacing w:after="0"/>
-      </w:pPr>
-      <w:r>
-        <w:t>('031835012', 'BRUFEN*30CPR RIV 600MG');</w:t>
-      </w:r>
-    </w:p>
-    <w:p>
-      <w:pPr>
-        <w:spacing w:after="0"/>
-      </w:pPr>
-    </w:p>
-    <w:p>
-      <w:pPr>
-        <w:spacing w:after="0"/>
-      </w:pPr>
-    </w:p>
-    <w:p>
-      <w:pPr>
-        <w:spacing w:after="0"/>
-      </w:pPr>
-    </w:p>
-    <w:p>
-      <w:pPr>
-        <w:spacing w:after="0"/>
-      </w:pPr>
-      <w:r>
-        <w:rPr>
-          <w:i/>
-          <w:iCs/>
-        </w:rPr>
-        <w:lastRenderedPageBreak/>
-        <w:t xml:space="preserve">-- Inserimento </w:t>
-      </w:r>
-      <w:r>
-        <w:rPr>
-          <w:i/>
-          <w:iCs/>
-        </w:rPr>
-        <w:t>dati delle p</w:t>
-      </w:r>
-      <w:r>
-        <w:rPr>
-          <w:i/>
-          <w:iCs/>
-        </w:rPr>
-        <w:t>rescrizion</w:t>
-      </w:r>
-      <w:r>
-        <w:rPr>
-          <w:i/>
-          <w:iCs/>
-        </w:rPr>
-        <w:t>i</w:t>
-      </w:r>
-    </w:p>
-    <w:p>
-      <w:pPr>
-        <w:spacing w:after="0"/>
-      </w:pPr>
-      <w:r>
-        <w:t>INSERT INTO Prescrizioni (</w:t>
-      </w:r>
-      <w:proofErr w:type="spellStart"/>
-      <w:r>
-        <w:t>ID_Prescrizione</w:t>
-      </w:r>
-      <w:proofErr w:type="spellEnd"/>
-      <w:r>
-        <w:t xml:space="preserve">, </w:t>
-      </w:r>
-      <w:proofErr w:type="spellStart"/>
-      <w:r>
-        <w:t>ID_Paziente</w:t>
-      </w:r>
-      <w:proofErr w:type="spellEnd"/>
-      <w:r>
-        <w:t xml:space="preserve">, </w:t>
-      </w:r>
-      <w:proofErr w:type="spellStart"/>
-      <w:r>
-        <w:t>ID_Medico</w:t>
-      </w:r>
-      <w:proofErr w:type="spellEnd"/>
-      <w:r>
-        <w:t xml:space="preserve">, </w:t>
-      </w:r>
-      <w:proofErr w:type="spellStart"/>
-      <w:r>
-        <w:t>Codice_AIC</w:t>
-      </w:r>
-      <w:proofErr w:type="spellEnd"/>
-      <w:r>
-        <w:t xml:space="preserve">, </w:t>
-      </w:r>
-      <w:proofErr w:type="spellStart"/>
-      <w:r>
-        <w:t>Data_Emissione</w:t>
-      </w:r>
-      <w:proofErr w:type="spellEnd"/>
-      <w:r>
-        <w:t xml:space="preserve">, </w:t>
-      </w:r>
-      <w:proofErr w:type="spellStart"/>
-      <w:r>
-        <w:t>Quantita</w:t>
-      </w:r>
-      <w:proofErr w:type="spellEnd"/>
-      <w:r>
-        <w:t xml:space="preserve">, Dettaglio, Organizzazione) </w:t>
-      </w:r>
-    </w:p>
-    <w:p>
-      <w:pPr>
-        <w:spacing w:after="0"/>
-      </w:pPr>
-      <w:r>
-        <w:t xml:space="preserve">VALUES ('PRF-2026-9999', 'PT-001', 'MED-120101', '012745098', '2026-05-11 11:30:00', 1, 'Paracetamolo 1000mg, 1 </w:t>
-      </w:r>
-      <w:proofErr w:type="spellStart"/>
-      <w:r>
-        <w:t>conf</w:t>
-      </w:r>
-      <w:proofErr w:type="spellEnd"/>
-      <w:r>
-        <w:t>', 'Sistema TS'),</w:t>
-      </w:r>
-    </w:p>
-    <w:p>
-      <w:pPr>
-        <w:spacing w:after="0"/>
-      </w:pPr>
-      <w:r>
-        <w:t>('PRF-2026-0001', 'PT-002', 'MED-120101', '012745098', '2026-05-12', 2, 'Tachipirina 1000mg, 2 confezioni - Trattamento iperpiressia', 'Sistema TS'),</w:t>
-      </w:r>
-    </w:p>
-    <w:p>
-      <w:pPr>
-        <w:spacing w:after="0"/>
-      </w:pPr>
-      <w:r>
-        <w:t>('PRF-2026-0002', 'PT-001', 'MED-120101', '035154035', '2026-05-13', 1, '</w:t>
-      </w:r>
-      <w:proofErr w:type="spellStart"/>
-      <w:r>
-        <w:t>Augmentin</w:t>
-      </w:r>
-      <w:proofErr w:type="spellEnd"/>
-      <w:r>
-        <w:t xml:space="preserve"> compresse, 1 confezione - Terapia antibiotica', 'Sistema TS'),</w:t>
-      </w:r>
-    </w:p>
-    <w:p>
-      <w:pPr>
-        <w:spacing w:after="0"/>
-      </w:pPr>
-      <w:r>
-        <w:t>('PRF-2026-0003', 'PT-003', 'MED-120101', '025218041', '2026-05-14', 1, 'Oki bustine, 1 confezione per cefalea tensiva', 'Sistema TS'),</w:t>
-      </w:r>
-    </w:p>
-    <w:p>
-      <w:pPr>
-        <w:spacing w:after="0"/>
-      </w:pPr>
-      <w:r>
-        <w:t>('PRF-2026-0004', 'PT-004', 'MED-120101', '031835012', '2026-05-15', 1, '</w:t>
-      </w:r>
-      <w:proofErr w:type="spellStart"/>
-      <w:r>
-        <w:t>Brufen</w:t>
-      </w:r>
-      <w:proofErr w:type="spellEnd"/>
-      <w:r>
-        <w:t xml:space="preserve"> 600mg, 1 confezione per algie articolari', 'Sistema TS'),</w:t>
-      </w:r>
-    </w:p>
-    <w:p>
-      <w:pPr>
-        <w:spacing w:after="0"/>
-      </w:pPr>
-      <w:r>
-        <w:t>('PRF-2026-0005', 'PT-002', 'MED-120101', '035154035', '2026-05-16', 1, '</w:t>
-      </w:r>
-      <w:proofErr w:type="spellStart"/>
-      <w:r>
-        <w:t>Augmentin</w:t>
-      </w:r>
-      <w:proofErr w:type="spellEnd"/>
-      <w:r>
-        <w:t xml:space="preserve"> compresse, 1 confezione - Terapia di follow-up', 'Sistema TS'),</w:t>
-      </w:r>
-    </w:p>
-    <w:p>
-      <w:pPr>
-        <w:spacing w:after="0"/>
-      </w:pPr>
-      <w:r>
-        <w:t xml:space="preserve">('PRF-2026-0006', 'PT-001', 'MED-120102', '012745098', '2026-05-17', 1, 'Tachipirina 1000mg, 1 confezione al </w:t>
-      </w:r>
-      <w:proofErr w:type="spellStart"/>
-      <w:r>
-        <w:t>bisogno'</w:t>
-      </w:r>
-      <w:proofErr w:type="spellEnd"/>
-      <w:r>
-        <w:t>, 'Sistema TS'),</w:t>
-      </w:r>
-    </w:p>
-    <w:p>
-      <w:pPr>
-        <w:spacing w:after="0"/>
-      </w:pPr>
-      <w:r>
-        <w:t>('PRF-2026-0007', 'PT-003', 'MED-120102', '025218041', '2026-05-18', 2, 'Oki 80mg bustine, 2 confezioni - Trattamento antinfiammatorio', 'Sistema TS'),</w:t>
-      </w:r>
-    </w:p>
-    <w:p>
-      <w:pPr>
-        <w:spacing w:after="0"/>
-      </w:pPr>
-      <w:r>
-        <w:t>('PRF-2026-0008', 'PT-004', 'MED-120102', '031835012', '2026-05-19', 1, '</w:t>
-      </w:r>
-      <w:proofErr w:type="spellStart"/>
-      <w:r>
-        <w:t>Brufen</w:t>
-      </w:r>
-      <w:proofErr w:type="spellEnd"/>
-      <w:r>
-        <w:t xml:space="preserve"> 600mg, 1 confezione post-estrattiva', 'Sistema TS'),</w:t>
-      </w:r>
-    </w:p>
-    <w:p>
-      <w:pPr>
-        <w:spacing w:after="0"/>
-      </w:pPr>
-      <w:r>
-        <w:t xml:space="preserve">('PRF-2026-0009', 'PT-002', 'MED-120102', '012745098', '2026-05-20', 1, 'Paracetamolo 1000mg, 1 </w:t>
-      </w:r>
-      <w:proofErr w:type="spellStart"/>
-      <w:r>
-        <w:t>conf</w:t>
-      </w:r>
-      <w:proofErr w:type="spellEnd"/>
-      <w:r>
-        <w:t xml:space="preserve"> per stato influenzale', 'Sistema TS');</w:t>
-      </w:r>
-    </w:p>
-    <w:p>
-      <w:pPr>
-        <w:spacing w:after="0"/>
-      </w:pPr>
-    </w:p>
-    <w:p>
-      <w:pPr>
-        <w:spacing w:after="0"/>
-      </w:pPr>
-      <w:r>
-        <w:t xml:space="preserve">-- </w:t>
-      </w:r>
-      <w:r>
-        <w:rPr>
-          <w:i/>
-          <w:iCs/>
-        </w:rPr>
-        <w:t>Query di esempio</w:t>
-      </w:r>
-    </w:p>
-    <w:p>
-      <w:pPr>
-        <w:spacing w:after="0"/>
-      </w:pPr>
-      <w:r>
-        <w:t xml:space="preserve">SELECT </w:t>
-      </w:r>
-      <w:proofErr w:type="spellStart"/>
-      <w:r>
-        <w:t>pr.Data_</w:t>
-      </w:r>
-      <w:r>
-        <w:rPr>
-          <w:u w:val="single"/>
-        </w:rPr>
-        <w:t>Emissione</w:t>
-      </w:r>
-      <w:proofErr w:type="spellEnd"/>
-      <w:r>
-        <w:t xml:space="preserve">, </w:t>
-      </w:r>
-      <w:proofErr w:type="spellStart"/>
-      <w:r>
-        <w:t>pr.ID_Prescrizione</w:t>
-      </w:r>
-      <w:proofErr w:type="spellEnd"/>
-      <w:r>
-        <w:t xml:space="preserve">, </w:t>
-      </w:r>
-      <w:proofErr w:type="spellStart"/>
-      <w:r>
-        <w:t>fa.Nome_Farmaco</w:t>
-      </w:r>
-      <w:proofErr w:type="spellEnd"/>
-      <w:r>
-        <w:t xml:space="preserve">, </w:t>
-      </w:r>
-      <w:proofErr w:type="spellStart"/>
-      <w:r>
-        <w:t>pr.Dettaglio</w:t>
-      </w:r>
-      <w:proofErr w:type="spellEnd"/>
-      <w:r>
-        <w:t xml:space="preserve">, </w:t>
-      </w:r>
-      <w:proofErr w:type="spellStart"/>
-      <w:r>
-        <w:t>pr.Organizzazione</w:t>
-      </w:r>
-      <w:proofErr w:type="spellEnd"/>
-      <w:r>
-        <w:t xml:space="preserve">, </w:t>
-      </w:r>
-      <w:proofErr w:type="spellStart"/>
-      <w:r>
-        <w:t>me.Cognome</w:t>
-      </w:r>
-      <w:proofErr w:type="spellEnd"/>
-      <w:r>
-        <w:t xml:space="preserve"> AS medico</w:t>
-      </w:r>
-    </w:p>
-    <w:p>
-      <w:pPr>
-        <w:spacing w:after="0"/>
-      </w:pPr>
-      <w:r>
-        <w:t xml:space="preserve">FROM Prescrizioni </w:t>
-      </w:r>
-      <w:proofErr w:type="spellStart"/>
-      <w:r>
-        <w:t>pr</w:t>
-      </w:r>
-      <w:proofErr w:type="spellEnd"/>
-    </w:p>
-    <w:p>
-      <w:pPr>
-        <w:spacing w:after="0"/>
-      </w:pPr>
-      <w:r>
-        <w:t xml:space="preserve">JOIN Pazienti </w:t>
-      </w:r>
-      <w:proofErr w:type="spellStart"/>
-      <w:r>
-        <w:t>pa</w:t>
-      </w:r>
-      <w:proofErr w:type="spellEnd"/>
-      <w:r>
-        <w:t xml:space="preserve"> ON </w:t>
-      </w:r>
-      <w:proofErr w:type="spellStart"/>
-      <w:r>
-        <w:t>pr.ID_Paziente</w:t>
-      </w:r>
-      <w:proofErr w:type="spellEnd"/>
-      <w:r>
-        <w:t xml:space="preserve"> = </w:t>
-      </w:r>
-      <w:proofErr w:type="spellStart"/>
-      <w:r>
-        <w:t>pa.ID_Paziente</w:t>
-      </w:r>
-      <w:proofErr w:type="spellEnd"/>
-    </w:p>
-    <w:p>
-      <w:pPr>
-        <w:spacing w:after="0"/>
-      </w:pPr>
-      <w:r>
-        <w:t xml:space="preserve">JOIN Farmaci fa ON </w:t>
-      </w:r>
-      <w:proofErr w:type="spellStart"/>
-      <w:r>
-        <w:t>pr.Codice_AIC</w:t>
-      </w:r>
-      <w:proofErr w:type="spellEnd"/>
-      <w:r>
-        <w:t xml:space="preserve"> = </w:t>
-      </w:r>
-      <w:proofErr w:type="spellStart"/>
-      <w:r>
-        <w:t>fa.Codice_AIC</w:t>
-      </w:r>
-      <w:proofErr w:type="spellEnd"/>
-    </w:p>
-    <w:p>
-      <w:pPr>
-        <w:spacing w:after="0"/>
-      </w:pPr>
-      <w:r>
-        <w:t xml:space="preserve">JOIN Medici me ON </w:t>
-      </w:r>
-      <w:proofErr w:type="spellStart"/>
-      <w:r>
-        <w:t>pr.ID_Medico</w:t>
-      </w:r>
-      <w:proofErr w:type="spellEnd"/>
-      <w:r>
-        <w:t xml:space="preserve"> = </w:t>
-      </w:r>
-      <w:proofErr w:type="spellStart"/>
-      <w:r>
-        <w:t>me.ID_Medico</w:t>
-      </w:r>
-      <w:proofErr w:type="spellEnd"/>
-    </w:p>
-    <w:p>
-      <w:pPr>
-        <w:spacing w:after="0"/>
-      </w:pPr>
-      <w:r>
-        <w:t xml:space="preserve">WHERE </w:t>
-      </w:r>
-      <w:proofErr w:type="spellStart"/>
-      <w:r>
-        <w:t>pa.Nome</w:t>
-      </w:r>
-      <w:proofErr w:type="spellEnd"/>
-      <w:r>
-        <w:t xml:space="preserve"> = 'Luigi' AND </w:t>
-      </w:r>
-      <w:proofErr w:type="spellStart"/>
-      <w:r>
-        <w:t>pa.Cognome</w:t>
-      </w:r>
-      <w:proofErr w:type="spellEnd"/>
-      <w:r>
-        <w:t xml:space="preserve"> = '</w:t>
-      </w:r>
-      <w:proofErr w:type="spellStart"/>
-      <w:r>
-        <w:t>Verdi'</w:t>
-      </w:r>
-      <w:proofErr w:type="spellEnd"/>
-    </w:p>
-    <w:p>
-      <w:pPr>
-        <w:spacing w:after="0"/>
-      </w:pPr>
-      <w:r>
-        <w:t xml:space="preserve">ORDER BY </w:t>
-      </w:r>
-      <w:proofErr w:type="spellStart"/>
-      <w:r>
-        <w:t>pr.Data_Emissione</w:t>
-      </w:r>
-      <w:proofErr w:type="spellEnd"/>
-      <w:r>
-        <w:t xml:space="preserve"> DESC;</w:t>
+        <w:t>-- Query di esempio</w:t>
+      </w:r>
+    </w:p>
+    <w:p>
+      <w:pPr>
+        <w:spacing w:after="0"/>
+      </w:pPr>
+      <w:r>
+        <w:t>SELECT pr.Data_Emissione, pr.ID_Prescrizione, fa.Nome_Farmaco, pr.Dettaglio, pr.Organizzazione, me.Cognome AS medico</w:t>
+      </w:r>
+    </w:p>
+    <w:p>
+      <w:pPr>
+        <w:spacing w:after="0"/>
+      </w:pPr>
+      <w:r>
+        <w:t>FROM Prescrizioni pr</w:t>
+      </w:r>
+    </w:p>
+    <w:p>
+      <w:pPr>
+        <w:spacing w:after="0"/>
+      </w:pPr>
+      <w:r>
+        <w:t>JOIN Pazienti pa ON pr.ID_Paziente = pa.ID_Paziente</w:t>
+      </w:r>
+    </w:p>
+    <w:p>
+      <w:pPr>
+        <w:spacing w:after="0"/>
+      </w:pPr>
+      <w:r>
+        <w:t>JOIN Farmaci fa ON pr.Codice_AIC = fa.Codice_AIC</w:t>
+      </w:r>
+    </w:p>
+    <w:p>
+      <w:pPr>
+        <w:spacing w:after="0"/>
+      </w:pPr>
+      <w:r>
+        <w:t>JOIN Medici me ON pr.ID_Medico = me.ID_Medico</w:t>
+      </w:r>
+    </w:p>
+    <w:p>
+      <w:pPr>
+        <w:spacing w:after="0"/>
+      </w:pPr>
+      <w:r>
+        <w:t>WHERE pa.Nome = 'Luigi' AND pa.Cognome = 'Verdi'</w:t>
+      </w:r>
+    </w:p>
+    <w:p>
+      <w:pPr>
+        <w:spacing w:after="0"/>
+      </w:pPr>
+      <w:r>
+        <w:t>ORDER BY pr.Data_Emissione DESC;</w:t>
       </w:r>
     </w:p>
     <w:sectPr>

</xml_diff>